<commit_message>
Fix degree name to Master of Science; align README with actual repo structure
</commit_message>
<xml_diff>
--- a/Documents/Final_Report.docx
+++ b/Documents/Final_Report.docx
@@ -108,7 +108,7 @@
         <w:jc w:val="center"/>
       </w:pPr>
       <w:r>
-        <w:t>Master of Engineering in Data Science and Engineering</w:t>
+        <w:t>Master of Science in Data Science and Engineering</w:t>
       </w:r>
     </w:p>
     <w:p/>
@@ -262,7 +262,7 @@
         <w:jc w:val="center"/>
       </w:pPr>
       <w:r>
-        <w:t>Master of Engineering in Data Science and Engineering</w:t>
+        <w:t>Master of Science in Data Science and Engineering</w:t>
       </w:r>
     </w:p>
     <w:p/>
@@ -458,7 +458,7 @@
         <w:t xml:space="preserve">Name of program: </w:t>
       </w:r>
       <w:r>
-        <w:t>Master of Data Science and Engineering</w:t>
+        <w:t>Master of Science in Data Science and Engineering</w:t>
       </w:r>
     </w:p>
     <w:p>
@@ -572,7 +572,7 @@
         <w:jc w:val="both"/>
       </w:pPr>
       <w:r>
-        <w:t>This is to certify that the research report that I, Mr. Sot So, am submitting this project called "Data Vault 2.0 Implementation for Cambodia Tax System Data Warehouse Using Medallion Architecture" for my Master of Engineering degree at Royal University of Phnom Penh, Faculty of Engineering. This is my own work and has not been used for any other degree or course at this or any other school.</w:t>
+        <w:t>This is to certify that the research report that I, Mr. Sot So, am submitting this project called "Data Vault 2.0 Implementation for Cambodia Tax System Data Warehouse Using Medallion Architecture" for my Master of Science degree at Royal University of Phnom Penh, Faculty of Engineering. This is my own work and has not been used for any other degree or course at this or any other school.</w:t>
       </w:r>
     </w:p>
     <w:p/>
@@ -582,7 +582,7 @@
         <w:jc w:val="both"/>
       </w:pPr>
       <w:r>
-        <w:t>For the degree of Master of Engineering at the Royal University of Phnom Penh is entirely my own work and, furthermore, that it has not been used to fulfill the requirements of any other qualification in whole or in part, at this or any other University or equivalent institution.</w:t>
+        <w:t>For the degree of Master of Science at the Royal University of Phnom Penh is entirely my own work and, furthermore, that it has not been used to fulfill the requirements of any other qualification in whole or in part, at this or any other University or equivalent institution.</w:t>
       </w:r>
     </w:p>
     <w:p/>
@@ -758,7 +758,7 @@
         <w:jc w:val="both"/>
       </w:pPr>
       <w:r>
-        <w:t>I am grateful to the faculty of the Master of Data Science and Engineering program at the Royal University of Phnom Penh, whose rigorous teaching and genuine mentorship broadened my academic perspective and deepened my command of the subject matter. Their dedication to nurturing data professionals in Cambodia has encouraged me to approach every problem with analytical discipline.</w:t>
+        <w:t>I am grateful to the faculty of the Master of Science in Data Science and Engineering program at the Royal University of Phnom Penh, whose rigorous teaching and genuine mentorship broadened my academic perspective and deepened my command of the subject matter. Their dedication to nurturing data professionals in Cambodia has encouraged me to approach every problem with analytical discipline.</w:t>
       </w:r>
     </w:p>
     <w:p>

</xml_diff>